<commit_message>
Expand manual role coverage
</commit_message>
<xml_diff>
--- a/docs/user-manual.docx
+++ b/docs/user-manual.docx
@@ -968,7 +968,7 @@
           <w:rPr>
             <w:rStyle w:val="Hyperlink"/>
           </w:rPr>
-          <w:t>17. Accounts and Accounting Roles</w:t>
+          <w:t>17. Finance Roles Guide</w:t>
         </w:r>
       </w:hyperlink>
     </w:p>
@@ -981,7 +981,7 @@
           <w:rPr>
             <w:rStyle w:val="Hyperlink"/>
           </w:rPr>
-          <w:t>17.1 What these roles do</w:t>
+          <w:t>17.1 Accounts role purpose</w:t>
         </w:r>
       </w:hyperlink>
     </w:p>
@@ -994,7 +994,7 @@
           <w:rPr>
             <w:rStyle w:val="Hyperlink"/>
           </w:rPr>
-          <w:t>17.2 Why these tasks matter</w:t>
+          <w:t>17.2 Task: Review and decide funding requests</w:t>
         </w:r>
       </w:hyperlink>
     </w:p>
@@ -1007,7 +1007,7 @@
           <w:rPr>
             <w:rStyle w:val="Hyperlink"/>
           </w:rPr>
-          <w:t>17.3 When these tasks happen</w:t>
+          <w:t>17.3 Task: Review purchase orders and goods receiving</w:t>
         </w:r>
       </w:hyperlink>
     </w:p>
@@ -1020,15 +1020,54 @@
           <w:rPr>
             <w:rStyle w:val="Hyperlink"/>
           </w:rPr>
-          <w:t>17.4 How these users normally work</w:t>
+          <w:t>17.4 Task: Review payment history and project financial position</w:t>
         </w:r>
       </w:hyperlink>
     </w:p>
     <w:p>
       <w:pPr>
+        <w:ind w:left="360"/>
+      </w:pPr>
+      <w:hyperlink w:anchor="toc_heading_80" w:history="1">
+        <w:r>
+          <w:rPr>
+            <w:rStyle w:val="Hyperlink"/>
+          </w:rPr>
+          <w:t>17.5 Accounting Officer and Accounting Clerk role focus</w:t>
+        </w:r>
+      </w:hyperlink>
+    </w:p>
+    <w:p>
+      <w:pPr>
+        <w:ind w:left="360"/>
+      </w:pPr>
+      <w:hyperlink w:anchor="toc_heading_81" w:history="1">
+        <w:r>
+          <w:rPr>
+            <w:rStyle w:val="Hyperlink"/>
+          </w:rPr>
+          <w:t>17.6 Accounting Auditor role focus</w:t>
+        </w:r>
+      </w:hyperlink>
+    </w:p>
+    <w:p>
+      <w:pPr>
+        <w:ind w:left="360"/>
+      </w:pPr>
+      <w:hyperlink w:anchor="toc_heading_82" w:history="1">
+        <w:r>
+          <w:rPr>
+            <w:rStyle w:val="Hyperlink"/>
+          </w:rPr>
+          <w:t>17.7 Cashier role focus</w:t>
+        </w:r>
+      </w:hyperlink>
+    </w:p>
+    <w:p>
+      <w:pPr>
         <w:ind w:left="0"/>
       </w:pPr>
-      <w:hyperlink w:anchor="toc_heading_80" w:history="1">
+      <w:hyperlink w:anchor="toc_heading_83" w:history="1">
         <w:r>
           <w:rPr>
             <w:rStyle w:val="Hyperlink"/>
@@ -1041,7 +1080,7 @@
       <w:pPr>
         <w:ind w:left="360"/>
       </w:pPr>
-      <w:hyperlink w:anchor="toc_heading_81" w:history="1">
+      <w:hyperlink w:anchor="toc_heading_84" w:history="1">
         <w:r>
           <w:rPr>
             <w:rStyle w:val="Hyperlink"/>
@@ -1054,7 +1093,7 @@
       <w:pPr>
         <w:ind w:left="360"/>
       </w:pPr>
-      <w:hyperlink w:anchor="toc_heading_82" w:history="1">
+      <w:hyperlink w:anchor="toc_heading_85" w:history="1">
         <w:r>
           <w:rPr>
             <w:rStyle w:val="Hyperlink"/>
@@ -1067,7 +1106,7 @@
       <w:pPr>
         <w:ind w:left="360"/>
       </w:pPr>
-      <w:hyperlink w:anchor="toc_heading_83" w:history="1">
+      <w:hyperlink w:anchor="toc_heading_86" w:history="1">
         <w:r>
           <w:rPr>
             <w:rStyle w:val="Hyperlink"/>
@@ -1080,20 +1119,98 @@
       <w:pPr>
         <w:ind w:left="0"/>
       </w:pPr>
-      <w:hyperlink w:anchor="toc_heading_84" w:history="1">
+      <w:hyperlink w:anchor="toc_heading_87" w:history="1">
         <w:r>
           <w:rPr>
             <w:rStyle w:val="Hyperlink"/>
           </w:rPr>
-          <w:t>19. Roles with Limited Confirmed Surface</w:t>
+          <w:t>19. Additional Confirmed Roles</w:t>
         </w:r>
       </w:hyperlink>
     </w:p>
     <w:p>
       <w:pPr>
+        <w:ind w:left="360"/>
+      </w:pPr>
+      <w:hyperlink w:anchor="toc_heading_88" w:history="1">
+        <w:r>
+          <w:rPr>
+            <w:rStyle w:val="Hyperlink"/>
+          </w:rPr>
+          <w:t>19.1 General Manager role focus</w:t>
+        </w:r>
+      </w:hyperlink>
+    </w:p>
+    <w:p>
+      <w:pPr>
+        <w:ind w:left="360"/>
+      </w:pPr>
+      <w:hyperlink w:anchor="toc_heading_89" w:history="1">
+        <w:r>
+          <w:rPr>
+            <w:rStyle w:val="Hyperlink"/>
+          </w:rPr>
+          <w:t>19.2 Foreman role focus</w:t>
+        </w:r>
+      </w:hyperlink>
+    </w:p>
+    <w:p>
+      <w:pPr>
+        <w:ind w:left="360"/>
+      </w:pPr>
+      <w:hyperlink w:anchor="toc_heading_90" w:history="1">
+        <w:r>
+          <w:rPr>
+            <w:rStyle w:val="Hyperlink"/>
+          </w:rPr>
+          <w:t>19.3 Human Resource role focus</w:t>
+        </w:r>
+      </w:hyperlink>
+    </w:p>
+    <w:p>
+      <w:pPr>
+        <w:ind w:left="360"/>
+      </w:pPr>
+      <w:hyperlink w:anchor="toc_heading_91" w:history="1">
+        <w:r>
+          <w:rPr>
+            <w:rStyle w:val="Hyperlink"/>
+          </w:rPr>
+          <w:t>19.4 PM Clerk role focus</w:t>
+        </w:r>
+      </w:hyperlink>
+    </w:p>
+    <w:p>
+      <w:pPr>
+        <w:ind w:left="360"/>
+      </w:pPr>
+      <w:hyperlink w:anchor="toc_heading_92" w:history="1">
+        <w:r>
+          <w:rPr>
+            <w:rStyle w:val="Hyperlink"/>
+          </w:rPr>
+          <w:t>19.5 Client role focus</w:t>
+        </w:r>
+      </w:hyperlink>
+    </w:p>
+    <w:p>
+      <w:pPr>
+        <w:ind w:left="360"/>
+      </w:pPr>
+      <w:hyperlink w:anchor="toc_heading_93" w:history="1">
+        <w:r>
+          <w:rPr>
+            <w:rStyle w:val="Hyperlink"/>
+          </w:rPr>
+          <w:t>19.6 Viewer role focus</w:t>
+        </w:r>
+      </w:hyperlink>
+    </w:p>
+    <w:p>
+      <w:pPr>
         <w:ind w:left="0"/>
       </w:pPr>
-      <w:hyperlink w:anchor="toc_heading_85" w:history="1">
+      <w:hyperlink w:anchor="toc_heading_94" w:history="1">
         <w:r>
           <w:rPr>
             <w:rStyle w:val="Hyperlink"/>
@@ -1106,7 +1223,7 @@
       <w:pPr>
         <w:ind w:left="360"/>
       </w:pPr>
-      <w:hyperlink w:anchor="toc_heading_86" w:history="1">
+      <w:hyperlink w:anchor="toc_heading_95" w:history="1">
         <w:r>
           <w:rPr>
             <w:rStyle w:val="Hyperlink"/>
@@ -1119,7 +1236,7 @@
       <w:pPr>
         <w:ind w:left="360"/>
       </w:pPr>
-      <w:hyperlink w:anchor="toc_heading_87" w:history="1">
+      <w:hyperlink w:anchor="toc_heading_96" w:history="1">
         <w:r>
           <w:rPr>
             <w:rStyle w:val="Hyperlink"/>
@@ -1132,7 +1249,7 @@
       <w:pPr>
         <w:ind w:left="360"/>
       </w:pPr>
-      <w:hyperlink w:anchor="toc_heading_88" w:history="1">
+      <w:hyperlink w:anchor="toc_heading_97" w:history="1">
         <w:r>
           <w:rPr>
             <w:rStyle w:val="Hyperlink"/>
@@ -1145,7 +1262,7 @@
       <w:pPr>
         <w:ind w:left="360"/>
       </w:pPr>
-      <w:hyperlink w:anchor="toc_heading_89" w:history="1">
+      <w:hyperlink w:anchor="toc_heading_98" w:history="1">
         <w:r>
           <w:rPr>
             <w:rStyle w:val="Hyperlink"/>
@@ -1158,7 +1275,7 @@
       <w:pPr>
         <w:ind w:left="0"/>
       </w:pPr>
-      <w:hyperlink w:anchor="toc_heading_90" w:history="1">
+      <w:hyperlink w:anchor="toc_heading_99" w:history="1">
         <w:r>
           <w:rPr>
             <w:rStyle w:val="Hyperlink"/>
@@ -1171,7 +1288,7 @@
       <w:pPr>
         <w:ind w:left="0"/>
       </w:pPr>
-      <w:hyperlink w:anchor="toc_heading_91" w:history="1">
+      <w:hyperlink w:anchor="toc_heading_100" w:history="1">
         <w:r>
           <w:rPr>
             <w:rStyle w:val="Hyperlink"/>
@@ -2113,6 +2230,14 @@
         <w:pStyle w:val="ListBullet"/>
       </w:pPr>
       <w:r>
+        <w:t>General Manager</w:t>
+      </w:r>
+    </w:p>
+    <w:p>
+      <w:pPr>
+        <w:pStyle w:val="ListBullet"/>
+      </w:pPr>
+      <w:r>
         <w:t>Managing Director</w:t>
       </w:r>
     </w:p>
@@ -2121,7 +2246,7 @@
         <w:pStyle w:val="ListBullet"/>
       </w:pPr>
       <w:r>
-        <w:t>Administrator functions in the codebase</w:t>
+        <w:t>Administrator</w:t>
       </w:r>
     </w:p>
     <w:p>
@@ -2129,7 +2254,7 @@
         <w:pStyle w:val="ListBullet"/>
       </w:pPr>
       <w:r>
-        <w:t>Accounts and accounting roles in the codebase</w:t>
+        <w:t>Accounts</w:t>
       </w:r>
     </w:p>
     <w:p>
@@ -2137,7 +2262,7 @@
         <w:pStyle w:val="ListBullet"/>
       </w:pPr>
       <w:r>
-        <w:t>Foreman in the codebase</w:t>
+        <w:t>Accounting Clerk</w:t>
       </w:r>
     </w:p>
     <w:p>
@@ -2145,7 +2270,63 @@
         <w:pStyle w:val="ListBullet"/>
       </w:pPr>
       <w:r>
-        <w:t>Client, Viewer, PM Clerk, and Human Resource roles in the codebase</w:t>
+        <w:t>Accounting Officer</w:t>
+      </w:r>
+    </w:p>
+    <w:p>
+      <w:pPr>
+        <w:pStyle w:val="ListBullet"/>
+      </w:pPr>
+      <w:r>
+        <w:t>Accounting Auditor</w:t>
+      </w:r>
+    </w:p>
+    <w:p>
+      <w:pPr>
+        <w:pStyle w:val="ListBullet"/>
+      </w:pPr>
+      <w:r>
+        <w:t>Cashier</w:t>
+      </w:r>
+    </w:p>
+    <w:p>
+      <w:pPr>
+        <w:pStyle w:val="ListBullet"/>
+      </w:pPr>
+      <w:r>
+        <w:t>Foreman</w:t>
+      </w:r>
+    </w:p>
+    <w:p>
+      <w:pPr>
+        <w:pStyle w:val="ListBullet"/>
+      </w:pPr>
+      <w:r>
+        <w:t>PM Clerk</w:t>
+      </w:r>
+    </w:p>
+    <w:p>
+      <w:pPr>
+        <w:pStyle w:val="ListBullet"/>
+      </w:pPr>
+      <w:r>
+        <w:t>Human Resource</w:t>
+      </w:r>
+    </w:p>
+    <w:p>
+      <w:pPr>
+        <w:pStyle w:val="ListBullet"/>
+      </w:pPr>
+      <w:r>
+        <w:t>Client</w:t>
+      </w:r>
+    </w:p>
+    <w:p>
+      <w:pPr>
+        <w:pStyle w:val="ListBullet"/>
+      </w:pPr>
+      <w:r>
+        <w:t>Viewer</w:t>
       </w:r>
     </w:p>
     <w:p/>
@@ -6983,14 +7164,14 @@
         <w:pStyle w:val="Heading2"/>
       </w:pPr>
       <w:r>
-        <w:t>17. Accounts and Accounting Roles</w:t>
+        <w:t>17. Finance Roles Guide</w:t>
       </w:r>
       <w:bookmarkEnd w:id="75"/>
     </w:p>
     <w:p/>
     <w:p>
       <w:r>
-        <w:t>The codebase includes `ACCOUNTS`, `ACCOUNTING_CLERK`, `ACCOUNTING_OFFICER`, `ACCOUNTING_AUDITOR`, and `CASHIER` roles. These roles were identified from the protected navigation and workflow rules, but live screenshots were not captured because credentials were not provided.</w:t>
+        <w:t>The codebase includes `ACCOUNTS`, `ACCOUNTING_CLERK`, `ACCOUNTING_OFFICER`, `ACCOUNTING_AUDITOR`, and `CASHIER` roles. These roles were identified from the protected navigation, funding actions, purchase-order controls, payment pages, and project finance views. Live screenshots were not captured because credentials were not provided for these accounts.</w:t>
       </w:r>
     </w:p>
     <w:p/>
@@ -7000,33 +7181,70 @@
         <w:pStyle w:val="Heading3"/>
       </w:pPr>
       <w:r>
-        <w:t>17.1 What these roles do</w:t>
+        <w:t>17.1 Accounts role purpose</w:t>
       </w:r>
       <w:bookmarkEnd w:id="76"/>
     </w:p>
     <w:p/>
     <w:p>
+      <w:r>
+        <w:t>The Accounts role is the main finance-control role for outgoing approvals, receipts verification, and finance review across projects.</w:t>
+      </w:r>
+    </w:p>
+    <w:p/>
+    <w:p>
+      <w:bookmarkStart w:id="77" w:name="toc_heading_77"/>
+      <w:pPr>
+        <w:pStyle w:val="Heading3"/>
+      </w:pPr>
+      <w:r>
+        <w:t>17.2 Task: Review and decide funding requests</w:t>
+      </w:r>
+      <w:bookmarkEnd w:id="77"/>
+    </w:p>
+    <w:p/>
+    <w:p>
+      <w:r>
+        <w:t>What:</w:t>
+      </w:r>
+    </w:p>
+    <w:p/>
+    <w:p>
       <w:pPr>
         <w:pStyle w:val="ListBullet"/>
       </w:pPr>
       <w:r>
-        <w:t>review funding requests</w:t>
-      </w:r>
-    </w:p>
+        <w:t>Review funding requests raised from procurement and decide whether they should be approved, rejected, or postponed.</w:t>
+      </w:r>
+    </w:p>
+    <w:p/>
+    <w:p>
+      <w:r>
+        <w:t>Why:</w:t>
+      </w:r>
+    </w:p>
+    <w:p/>
     <w:p>
       <w:pPr>
         <w:pStyle w:val="ListBullet"/>
       </w:pPr>
       <w:r>
-        <w:t>approve or reject funding</w:t>
-      </w:r>
-    </w:p>
+        <w:t>Funding approval is the main finance gate before procurement can continue.</w:t>
+      </w:r>
+    </w:p>
+    <w:p/>
+    <w:p>
+      <w:r>
+        <w:t>When:</w:t>
+      </w:r>
+    </w:p>
+    <w:p/>
     <w:p>
       <w:pPr>
         <w:pStyle w:val="ListBullet"/>
       </w:pPr>
       <w:r>
-        <w:t>review payment history</w:t>
+        <w:t>When procurement submits a funding request.</w:t>
       </w:r>
     </w:p>
     <w:p>
@@ -7034,27 +7252,185 @@
         <w:pStyle w:val="ListBullet"/>
       </w:pPr>
       <w:r>
-        <w:t>review profit and loss views</w:t>
-      </w:r>
-    </w:p>
+        <w:t>During finance review meetings and daily approval cycles.</w:t>
+      </w:r>
+    </w:p>
+    <w:p/>
+    <w:p>
+      <w:r>
+        <w:t>How:</w:t>
+      </w:r>
+    </w:p>
+    <w:p/>
+    <w:p>
+      <w:pPr>
+        <w:pStyle w:val="ListNumber"/>
+      </w:pPr>
+      <w:r>
+        <w:t xml:space="preserve">Open </w:t>
+      </w:r>
+      <w:r>
+        <w:rPr>
+          <w:b/>
+        </w:rPr>
+        <w:t>Funds</w:t>
+      </w:r>
+      <w:r>
+        <w:t xml:space="preserve"> or the Accounts funding dashboard.</w:t>
+      </w:r>
+    </w:p>
+    <w:p>
+      <w:pPr>
+        <w:pStyle w:val="ListNumber"/>
+      </w:pPr>
+      <w:r>
+        <w:t>Review the requisition, project, requested amount, and supporting reason.</w:t>
+      </w:r>
+    </w:p>
+    <w:p>
+      <w:pPr>
+        <w:pStyle w:val="ListNumber"/>
+      </w:pPr>
+      <w:r>
+        <w:t>Approve, reject, or postpone the funding request according to company policy.</w:t>
+      </w:r>
+    </w:p>
+    <w:p>
+      <w:pPr>
+        <w:pStyle w:val="ListNumber"/>
+      </w:pPr>
+      <w:r>
+        <w:t>Confirm the funding status has updated for the procurement workflow.</w:t>
+      </w:r>
+    </w:p>
+    <w:p/>
+    <w:p>
+      <w:bookmarkStart w:id="78" w:name="toc_heading_78"/>
+      <w:pPr>
+        <w:pStyle w:val="Heading3"/>
+      </w:pPr>
+      <w:r>
+        <w:t>17.3 Task: Review purchase orders and goods receiving</w:t>
+      </w:r>
+      <w:bookmarkEnd w:id="78"/>
+    </w:p>
+    <w:p/>
+    <w:p>
+      <w:r>
+        <w:t>What:</w:t>
+      </w:r>
+    </w:p>
+    <w:p/>
     <w:p>
       <w:pPr>
         <w:pStyle w:val="ListBullet"/>
       </w:pPr>
       <w:r>
-        <w:t>access payments and finance-related operational pages</w:t>
-      </w:r>
-    </w:p>
-    <w:p/>
-    <w:p>
-      <w:bookmarkStart w:id="77" w:name="toc_heading_77"/>
+        <w:t>Review purchase orders from a finance-control perspective and verify goods-received entries where required.</w:t>
+      </w:r>
+    </w:p>
+    <w:p/>
+    <w:p>
+      <w:r>
+        <w:t>Why:</w:t>
+      </w:r>
+    </w:p>
+    <w:p/>
+    <w:p>
+      <w:pPr>
+        <w:pStyle w:val="ListBullet"/>
+      </w:pPr>
+      <w:r>
+        <w:t>Purchase-order approval and goods-receipt verification help control spend and confirm that received items match what was expected.</w:t>
+      </w:r>
+    </w:p>
+    <w:p/>
+    <w:p>
+      <w:r>
+        <w:t>When:</w:t>
+      </w:r>
+    </w:p>
+    <w:p/>
+    <w:p>
+      <w:pPr>
+        <w:pStyle w:val="ListBullet"/>
+      </w:pPr>
+      <w:r>
+        <w:t>When a purchase order reaches the finance approval stage.</w:t>
+      </w:r>
+    </w:p>
+    <w:p>
+      <w:pPr>
+        <w:pStyle w:val="ListBullet"/>
+      </w:pPr>
+      <w:r>
+        <w:t>When a goods-received note is awaiting verification.</w:t>
+      </w:r>
+    </w:p>
+    <w:p/>
+    <w:p>
+      <w:r>
+        <w:t>How:</w:t>
+      </w:r>
+    </w:p>
+    <w:p/>
+    <w:p>
+      <w:pPr>
+        <w:pStyle w:val="ListNumber"/>
+      </w:pPr>
+      <w:r>
+        <w:t xml:space="preserve">Open </w:t>
+      </w:r>
+      <w:r>
+        <w:rPr>
+          <w:b/>
+        </w:rPr>
+        <w:t>Purchase Orders</w:t>
+      </w:r>
+      <w:r>
+        <w:t xml:space="preserve"> or the Accounts goods-receiving view.</w:t>
+      </w:r>
+    </w:p>
+    <w:p>
+      <w:pPr>
+        <w:pStyle w:val="ListNumber"/>
+      </w:pPr>
+      <w:r>
+        <w:t>Review the order amount, project, vendor, and receipt details.</w:t>
+      </w:r>
+    </w:p>
+    <w:p>
+      <w:pPr>
+        <w:pStyle w:val="ListNumber"/>
+      </w:pPr>
+      <w:r>
+        <w:t>Approve or reject the purchase order where permitted.</w:t>
+      </w:r>
+    </w:p>
+    <w:p>
+      <w:pPr>
+        <w:pStyle w:val="ListNumber"/>
+      </w:pPr>
+      <w:r>
+        <w:t>Verify the goods-received quantities and save the outcome.</w:t>
+      </w:r>
+    </w:p>
+    <w:p/>
+    <w:p>
+      <w:bookmarkStart w:id="79" w:name="toc_heading_79"/>
       <w:pPr>
         <w:pStyle w:val="Heading3"/>
       </w:pPr>
       <w:r>
-        <w:t>17.2 Why these tasks matter</w:t>
-      </w:r>
-      <w:bookmarkEnd w:id="77"/>
+        <w:t>17.4 Task: Review payment history and project financial position</w:t>
+      </w:r>
+      <w:bookmarkEnd w:id="79"/>
+    </w:p>
+    <w:p/>
+    <w:p>
+      <w:r>
+        <w:t>What:</w:t>
+      </w:r>
     </w:p>
     <w:p/>
     <w:p>
@@ -7062,19 +7438,129 @@
         <w:pStyle w:val="ListBullet"/>
       </w:pPr>
       <w:r>
-        <w:t>Finance control protects cashflow, procurement discipline, and project reporting accuracy.</w:t>
-      </w:r>
-    </w:p>
-    <w:p/>
-    <w:p>
-      <w:bookmarkStart w:id="78" w:name="toc_heading_78"/>
+        <w:t>Use finance reporting views to review what has been paid, what remains outstanding, and how projects are performing financially.</w:t>
+      </w:r>
+    </w:p>
+    <w:p/>
+    <w:p>
+      <w:r>
+        <w:t>Why:</w:t>
+      </w:r>
+    </w:p>
+    <w:p/>
+    <w:p>
+      <w:pPr>
+        <w:pStyle w:val="ListBullet"/>
+      </w:pPr>
+      <w:r>
+        <w:t>Finance oversight depends on accurate visibility into receipts, profitability, and project-level financial exposure.</w:t>
+      </w:r>
+    </w:p>
+    <w:p/>
+    <w:p>
+      <w:r>
+        <w:t>When:</w:t>
+      </w:r>
+    </w:p>
+    <w:p/>
+    <w:p>
+      <w:pPr>
+        <w:pStyle w:val="ListBullet"/>
+      </w:pPr>
+      <w:r>
+        <w:t>During daily finance review.</w:t>
+      </w:r>
+    </w:p>
+    <w:p>
+      <w:pPr>
+        <w:pStyle w:val="ListBullet"/>
+      </w:pPr>
+      <w:r>
+        <w:t>During month-end, audit preparation, or management reporting.</w:t>
+      </w:r>
+    </w:p>
+    <w:p/>
+    <w:p>
+      <w:r>
+        <w:t>How:</w:t>
+      </w:r>
+    </w:p>
+    <w:p/>
+    <w:p>
+      <w:pPr>
+        <w:pStyle w:val="ListNumber"/>
+      </w:pPr>
+      <w:r>
+        <w:t xml:space="preserve">Open </w:t>
+      </w:r>
+      <w:r>
+        <w:rPr>
+          <w:b/>
+        </w:rPr>
+        <w:t>Payments</w:t>
+      </w:r>
+      <w:r>
+        <w:t xml:space="preserve">, </w:t>
+      </w:r>
+      <w:r>
+        <w:rPr>
+          <w:b/>
+        </w:rPr>
+        <w:t>Payment History</w:t>
+      </w:r>
+      <w:r>
+        <w:t xml:space="preserve">, or </w:t>
+      </w:r>
+      <w:r>
+        <w:rPr>
+          <w:b/>
+        </w:rPr>
+        <w:t>Profit and Loss</w:t>
+      </w:r>
+      <w:r>
+        <w:t>.</w:t>
+      </w:r>
+    </w:p>
+    <w:p>
+      <w:pPr>
+        <w:pStyle w:val="ListNumber"/>
+      </w:pPr>
+      <w:r>
+        <w:t>Select the relevant project or report view.</w:t>
+      </w:r>
+    </w:p>
+    <w:p>
+      <w:pPr>
+        <w:pStyle w:val="ListNumber"/>
+      </w:pPr>
+      <w:r>
+        <w:t>Review paid-to-date values, outstanding balances, and profit position.</w:t>
+      </w:r>
+    </w:p>
+    <w:p>
+      <w:pPr>
+        <w:pStyle w:val="ListNumber"/>
+      </w:pPr>
+      <w:r>
+        <w:t>Use the findings for follow-up, approval, or escalation.</w:t>
+      </w:r>
+    </w:p>
+    <w:p/>
+    <w:p>
+      <w:bookmarkStart w:id="80" w:name="toc_heading_80"/>
       <w:pPr>
         <w:pStyle w:val="Heading3"/>
       </w:pPr>
       <w:r>
-        <w:t>17.3 When these tasks happen</w:t>
-      </w:r>
-      <w:bookmarkEnd w:id="78"/>
+        <w:t>17.5 Accounting Officer and Accounting Clerk role focus</w:t>
+      </w:r>
+      <w:bookmarkEnd w:id="80"/>
+    </w:p>
+    <w:p/>
+    <w:p>
+      <w:r>
+        <w:t>What:</w:t>
+      </w:r>
     </w:p>
     <w:p/>
     <w:p>
@@ -7082,23 +7568,37 @@
         <w:pStyle w:val="ListBullet"/>
       </w:pPr>
       <w:r>
-        <w:t>when procurement requests funding</w:t>
-      </w:r>
-    </w:p>
+        <w:t>Support the Accounts workflow by reviewing funding requests, handling purchase-order decisions, checking goods receipts, and monitoring finance reports.</w:t>
+      </w:r>
+    </w:p>
+    <w:p/>
+    <w:p>
+      <w:r>
+        <w:t>Why:</w:t>
+      </w:r>
+    </w:p>
+    <w:p/>
     <w:p>
       <w:pPr>
         <w:pStyle w:val="ListBullet"/>
       </w:pPr>
       <w:r>
-        <w:t>when client payments are received</w:t>
-      </w:r>
-    </w:p>
+        <w:t>These roles extend day-to-day finance processing capacity while preserving controlled approval steps.</w:t>
+      </w:r>
+    </w:p>
+    <w:p/>
+    <w:p>
+      <w:r>
+        <w:t>When:</w:t>
+      </w:r>
+    </w:p>
+    <w:p/>
     <w:p>
       <w:pPr>
         <w:pStyle w:val="ListBullet"/>
       </w:pPr>
       <w:r>
-        <w:t>during daily finance review</w:t>
+        <w:t>During normal finance operations.</w:t>
       </w:r>
     </w:p>
     <w:p>
@@ -7106,19 +7606,145 @@
         <w:pStyle w:val="ListBullet"/>
       </w:pPr>
       <w:r>
-        <w:t>during end-of-period reporting</w:t>
-      </w:r>
-    </w:p>
-    <w:p/>
-    <w:p>
-      <w:bookmarkStart w:id="79" w:name="toc_heading_79"/>
+        <w:t>When funding, purchase-order, or receipt queues need action.</w:t>
+      </w:r>
+    </w:p>
+    <w:p/>
+    <w:p>
+      <w:r>
+        <w:t>How:</w:t>
+      </w:r>
+    </w:p>
+    <w:p/>
+    <w:p>
+      <w:pPr>
+        <w:pStyle w:val="ListNumber"/>
+      </w:pPr>
+      <w:r>
+        <w:t xml:space="preserve">Open the assigned finance queue such as </w:t>
+      </w:r>
+      <w:r>
+        <w:rPr>
+          <w:b/>
+        </w:rPr>
+        <w:t>Funds</w:t>
+      </w:r>
+      <w:r>
+        <w:t xml:space="preserve">, </w:t>
+      </w:r>
+      <w:r>
+        <w:rPr>
+          <w:b/>
+        </w:rPr>
+        <w:t>Purchase Orders</w:t>
+      </w:r>
+      <w:r>
+        <w:t>, or receipt verification.</w:t>
+      </w:r>
+    </w:p>
+    <w:p>
+      <w:pPr>
+        <w:pStyle w:val="ListNumber"/>
+      </w:pPr>
+      <w:r>
+        <w:t>Review the supporting details for the request or receipt.</w:t>
+      </w:r>
+    </w:p>
+    <w:p>
+      <w:pPr>
+        <w:pStyle w:val="ListNumber"/>
+      </w:pPr>
+      <w:r>
+        <w:t>Apply the permitted decision or verification step according to internal approval rules.</w:t>
+      </w:r>
+    </w:p>
+    <w:p>
+      <w:pPr>
+        <w:pStyle w:val="ListNumber"/>
+      </w:pPr>
+      <w:r>
+        <w:t xml:space="preserve">Use report pages such as </w:t>
+      </w:r>
+      <w:r>
+        <w:rPr>
+          <w:b/>
+        </w:rPr>
+        <w:t>Payment History</w:t>
+      </w:r>
+      <w:r>
+        <w:t xml:space="preserve"> and </w:t>
+      </w:r>
+      <w:r>
+        <w:rPr>
+          <w:b/>
+        </w:rPr>
+        <w:t>Profit and Loss</w:t>
+      </w:r>
+      <w:r>
+        <w:t xml:space="preserve"> for monitoring and follow-up.</w:t>
+      </w:r>
+    </w:p>
+    <w:p/>
+    <w:p>
+      <w:bookmarkStart w:id="81" w:name="toc_heading_81"/>
       <w:pPr>
         <w:pStyle w:val="Heading3"/>
       </w:pPr>
       <w:r>
-        <w:t>17.4 How these users normally work</w:t>
-      </w:r>
-      <w:bookmarkEnd w:id="79"/>
+        <w:t>17.6 Accounting Auditor role focus</w:t>
+      </w:r>
+      <w:bookmarkEnd w:id="81"/>
+    </w:p>
+    <w:p/>
+    <w:p>
+      <w:r>
+        <w:t>What:</w:t>
+      </w:r>
+    </w:p>
+    <w:p/>
+    <w:p>
+      <w:pPr>
+        <w:pStyle w:val="ListBullet"/>
+      </w:pPr>
+      <w:r>
+        <w:t>Review finance-facing project information and financial reports without being the primary day-to-day processing role.</w:t>
+      </w:r>
+    </w:p>
+    <w:p/>
+    <w:p>
+      <w:r>
+        <w:t>Why:</w:t>
+      </w:r>
+    </w:p>
+    <w:p/>
+    <w:p>
+      <w:pPr>
+        <w:pStyle w:val="ListBullet"/>
+      </w:pPr>
+      <w:r>
+        <w:t>Audit-oriented visibility helps confirm that finance activity is traceable and consistent.</w:t>
+      </w:r>
+    </w:p>
+    <w:p/>
+    <w:p>
+      <w:r>
+        <w:t>When:</w:t>
+      </w:r>
+    </w:p>
+    <w:p/>
+    <w:p>
+      <w:pPr>
+        <w:pStyle w:val="ListBullet"/>
+      </w:pPr>
+      <w:r>
+        <w:t>During audit review, exception review, and financial oversight cycles.</w:t>
+      </w:r>
+    </w:p>
+    <w:p/>
+    <w:p>
+      <w:r>
+        <w:t>How:</w:t>
+      </w:r>
     </w:p>
     <w:p/>
     <w:p>
@@ -7126,7 +7752,7 @@
         <w:pStyle w:val="ListNumber"/>
       </w:pPr>
       <w:r>
-        <w:t>Open the finance module relevant to the task.</w:t>
+        <w:t>Open project, payment-history, or profit-and-loss views available to the role.</w:t>
       </w:r>
     </w:p>
     <w:p>
@@ -7134,7 +7760,7 @@
         <w:pStyle w:val="ListNumber"/>
       </w:pPr>
       <w:r>
-        <w:t>Review the underlying project or funding record.</w:t>
+        <w:t>Review the supporting financial records.</w:t>
       </w:r>
     </w:p>
     <w:p>
@@ -7142,27 +7768,114 @@
         <w:pStyle w:val="ListNumber"/>
       </w:pPr>
       <w:r>
-        <w:t>Confirm the financial details.</w:t>
-      </w:r>
-    </w:p>
+        <w:t>Identify exceptions or items requiring follow-up.</w:t>
+      </w:r>
+    </w:p>
+    <w:p/>
+    <w:p>
+      <w:bookmarkStart w:id="82" w:name="toc_heading_82"/>
+      <w:pPr>
+        <w:pStyle w:val="Heading3"/>
+      </w:pPr>
+      <w:r>
+        <w:t>17.7 Cashier role focus</w:t>
+      </w:r>
+      <w:bookmarkEnd w:id="82"/>
+    </w:p>
+    <w:p/>
+    <w:p>
+      <w:r>
+        <w:t>What:</w:t>
+      </w:r>
+    </w:p>
+    <w:p/>
+    <w:p>
+      <w:pPr>
+        <w:pStyle w:val="ListBullet"/>
+      </w:pPr>
+      <w:r>
+        <w:t>Support finance operations where direct payment or disbursement recording is assigned.</w:t>
+      </w:r>
+    </w:p>
+    <w:p/>
+    <w:p>
+      <w:r>
+        <w:t>Why:</w:t>
+      </w:r>
+    </w:p>
+    <w:p/>
+    <w:p>
+      <w:pPr>
+        <w:pStyle w:val="ListBullet"/>
+      </w:pPr>
+      <w:r>
+        <w:t>Cash handling and payment entry need controlled system posting.</w:t>
+      </w:r>
+    </w:p>
+    <w:p/>
+    <w:p>
+      <w:r>
+        <w:t>When:</w:t>
+      </w:r>
+    </w:p>
+    <w:p/>
+    <w:p>
+      <w:pPr>
+        <w:pStyle w:val="ListBullet"/>
+      </w:pPr>
+      <w:r>
+        <w:t>When a payment or approved disbursement must be recorded in the system.</w:t>
+      </w:r>
+    </w:p>
+    <w:p/>
+    <w:p>
+      <w:r>
+        <w:t>How:</w:t>
+      </w:r>
+    </w:p>
+    <w:p/>
     <w:p>
       <w:pPr>
         <w:pStyle w:val="ListNumber"/>
       </w:pPr>
       <w:r>
-        <w:t>Approve, reject, or record the financial outcome according to policy.</w:t>
-      </w:r>
-    </w:p>
-    <w:p/>
-    <w:p>
-      <w:bookmarkStart w:id="80" w:name="toc_heading_80"/>
+        <w:t>Open the assigned project or finance page.</w:t>
+      </w:r>
+    </w:p>
+    <w:p>
+      <w:pPr>
+        <w:pStyle w:val="ListNumber"/>
+      </w:pPr>
+      <w:r>
+        <w:t>Review the amount, reference, and payment context.</w:t>
+      </w:r>
+    </w:p>
+    <w:p>
+      <w:pPr>
+        <w:pStyle w:val="ListNumber"/>
+      </w:pPr>
+      <w:r>
+        <w:t>Record the financial entry where the workflow allows cashier action.</w:t>
+      </w:r>
+    </w:p>
+    <w:p>
+      <w:pPr>
+        <w:pStyle w:val="ListNumber"/>
+      </w:pPr>
+      <w:r>
+        <w:t>Confirm the updated payment or disbursement position.</w:t>
+      </w:r>
+    </w:p>
+    <w:p/>
+    <w:p>
+      <w:bookmarkStart w:id="83" w:name="toc_heading_83"/>
       <w:pPr>
         <w:pStyle w:val="Heading2"/>
       </w:pPr>
       <w:r>
         <w:t>18. Administrator Guide</w:t>
       </w:r>
-      <w:bookmarkEnd w:id="80"/>
+      <w:bookmarkEnd w:id="83"/>
     </w:p>
     <w:p/>
     <w:p>
@@ -7199,14 +7912,14 @@
     </w:p>
     <w:p/>
     <w:p>
-      <w:bookmarkStart w:id="81" w:name="toc_heading_81"/>
+      <w:bookmarkStart w:id="84" w:name="toc_heading_84"/>
       <w:pPr>
         <w:pStyle w:val="Heading3"/>
       </w:pPr>
       <w:r>
         <w:t>18.1 Task: Manage users</w:t>
       </w:r>
-      <w:bookmarkEnd w:id="81"/>
+      <w:bookmarkEnd w:id="84"/>
     </w:p>
     <w:p/>
     <w:p>
@@ -7295,14 +8008,14 @@
     </w:p>
     <w:p/>
     <w:p>
-      <w:bookmarkStart w:id="82" w:name="toc_heading_82"/>
+      <w:bookmarkStart w:id="85" w:name="toc_heading_85"/>
       <w:pPr>
         <w:pStyle w:val="Heading3"/>
       </w:pPr>
       <w:r>
         <w:t>18.2 Task: Review audit logs</w:t>
       </w:r>
-      <w:bookmarkEnd w:id="82"/>
+      <w:bookmarkEnd w:id="85"/>
     </w:p>
     <w:p/>
     <w:p>
@@ -7391,14 +8104,14 @@
     </w:p>
     <w:p/>
     <w:p>
-      <w:bookmarkStart w:id="83" w:name="toc_heading_83"/>
+      <w:bookmarkStart w:id="86" w:name="toc_heading_86"/>
       <w:pPr>
         <w:pStyle w:val="Heading3"/>
       </w:pPr>
       <w:r>
         <w:t>18.3 Task: Use the recycle bin</w:t>
       </w:r>
-      <w:bookmarkEnd w:id="83"/>
+      <w:bookmarkEnd w:id="86"/>
     </w:p>
     <w:p/>
     <w:p>
@@ -7487,19 +8200,36 @@
     </w:p>
     <w:p/>
     <w:p>
-      <w:bookmarkStart w:id="84" w:name="toc_heading_84"/>
+      <w:bookmarkStart w:id="87" w:name="toc_heading_87"/>
       <w:pPr>
         <w:pStyle w:val="Heading2"/>
       </w:pPr>
       <w:r>
-        <w:t>19. Roles with Limited Confirmed Surface</w:t>
-      </w:r>
-      <w:bookmarkEnd w:id="84"/>
-    </w:p>
-    <w:p/>
-    <w:p>
-      <w:r>
-        <w:t>The following roles exist in the codebase but do not currently have enough confirmed live surface in this documentation set to support screenshot-backed step-by-step instructions:</w:t>
+        <w:t>19. Additional Confirmed Roles</w:t>
+      </w:r>
+      <w:bookmarkEnd w:id="87"/>
+    </w:p>
+    <w:p/>
+    <w:p>
+      <w:r>
+        <w:t>The following roles are confirmed in the codebase and have identifiable tasks or route access, even though live screenshots were not captured for them in this documentation pass.</w:t>
+      </w:r>
+    </w:p>
+    <w:p/>
+    <w:p>
+      <w:bookmarkStart w:id="88" w:name="toc_heading_88"/>
+      <w:pPr>
+        <w:pStyle w:val="Heading3"/>
+      </w:pPr>
+      <w:r>
+        <w:t>19.1 General Manager role focus</w:t>
+      </w:r>
+      <w:bookmarkEnd w:id="88"/>
+    </w:p>
+    <w:p/>
+    <w:p>
+      <w:r>
+        <w:t>What:</w:t>
       </w:r>
     </w:p>
     <w:p/>
@@ -7508,76 +8238,578 @@
         <w:pStyle w:val="ListBullet"/>
       </w:pPr>
       <w:r>
-        <w:t>Client</w:t>
-      </w:r>
-    </w:p>
+        <w:t>Review project position, active requisitions, and management-level approval views.</w:t>
+      </w:r>
+    </w:p>
+    <w:p/>
+    <w:p>
+      <w:r>
+        <w:t>Why:</w:t>
+      </w:r>
+    </w:p>
+    <w:p/>
     <w:p>
       <w:pPr>
         <w:pStyle w:val="ListBullet"/>
       </w:pPr>
       <w:r>
-        <w:t>Viewer</w:t>
-      </w:r>
-    </w:p>
+        <w:t>The role supports senior operational oversight without relying on the day-to-day specialist queues.</w:t>
+      </w:r>
+    </w:p>
+    <w:p/>
+    <w:p>
+      <w:r>
+        <w:t>When:</w:t>
+      </w:r>
+    </w:p>
+    <w:p/>
     <w:p>
       <w:pPr>
         <w:pStyle w:val="ListBullet"/>
       </w:pPr>
       <w:r>
-        <w:t>PM Clerk</w:t>
-      </w:r>
-    </w:p>
+        <w:t>During management review, escalation handling, and cross-department coordination.</w:t>
+      </w:r>
+    </w:p>
+    <w:p/>
+    <w:p>
+      <w:r>
+        <w:t>How:</w:t>
+      </w:r>
+    </w:p>
+    <w:p/>
+    <w:p>
+      <w:pPr>
+        <w:pStyle w:val="ListNumber"/>
+      </w:pPr>
+      <w:r>
+        <w:t xml:space="preserve">Open </w:t>
+      </w:r>
+      <w:r>
+        <w:rPr>
+          <w:b/>
+        </w:rPr>
+        <w:t>Projects</w:t>
+      </w:r>
+      <w:r>
+        <w:t xml:space="preserve"> to review the live project portfolio.</w:t>
+      </w:r>
+    </w:p>
+    <w:p>
+      <w:pPr>
+        <w:pStyle w:val="ListNumber"/>
+      </w:pPr>
+      <w:r>
+        <w:t>Review project-linked requisitions and operational status where needed.</w:t>
+      </w:r>
+    </w:p>
+    <w:p>
+      <w:pPr>
+        <w:pStyle w:val="ListNumber"/>
+      </w:pPr>
+      <w:r>
+        <w:t>Access senior approval views that are also available to management, such as procurement approval flows, when a management decision is required.</w:t>
+      </w:r>
+    </w:p>
+    <w:p/>
+    <w:p>
+      <w:bookmarkStart w:id="89" w:name="toc_heading_89"/>
+      <w:pPr>
+        <w:pStyle w:val="Heading3"/>
+      </w:pPr>
+      <w:r>
+        <w:t>19.2 Foreman role focus</w:t>
+      </w:r>
+      <w:bookmarkEnd w:id="89"/>
+    </w:p>
+    <w:p/>
+    <w:p>
+      <w:r>
+        <w:t>What:</w:t>
+      </w:r>
+    </w:p>
+    <w:p/>
     <w:p>
       <w:pPr>
         <w:pStyle w:val="ListBullet"/>
       </w:pPr>
       <w:r>
-        <w:t>Human Resource</w:t>
-      </w:r>
-    </w:p>
+        <w:t>Monitor deliveries arriving for site work and review active assigned project reporting surfaces.</w:t>
+      </w:r>
+    </w:p>
+    <w:p/>
+    <w:p>
+      <w:r>
+        <w:t>Why:</w:t>
+      </w:r>
+    </w:p>
+    <w:p/>
     <w:p>
       <w:pPr>
         <w:pStyle w:val="ListBullet"/>
       </w:pPr>
       <w:r>
-        <w:t>Foreman</w:t>
-      </w:r>
-    </w:p>
+        <w:t>Site-facing supervision depends on clear visibility into what is arriving and what work is active on the ground.</w:t>
+      </w:r>
+    </w:p>
+    <w:p/>
+    <w:p>
+      <w:r>
+        <w:t>When:</w:t>
+      </w:r>
+    </w:p>
+    <w:p/>
     <w:p>
       <w:pPr>
         <w:pStyle w:val="ListBullet"/>
       </w:pPr>
       <w:r>
-        <w:t>General Manager</w:t>
-      </w:r>
-    </w:p>
-    <w:p/>
-    <w:p>
-      <w:r>
-        <w:t>Where these roles are visible in the codebase, their likely purpose is reflected by the route names and access rules. However, this manual avoids inventing unsupported task detail.</w:t>
-      </w:r>
-    </w:p>
-    <w:p/>
-    <w:p>
-      <w:bookmarkStart w:id="85" w:name="toc_heading_85"/>
+        <w:t>Before receiving deliveries and during active site execution.</w:t>
+      </w:r>
+    </w:p>
+    <w:p/>
+    <w:p>
+      <w:r>
+        <w:t>How:</w:t>
+      </w:r>
+    </w:p>
+    <w:p/>
+    <w:p>
+      <w:pPr>
+        <w:pStyle w:val="ListNumber"/>
+      </w:pPr>
+      <w:r>
+        <w:t xml:space="preserve">Open </w:t>
+      </w:r>
+      <w:r>
+        <w:rPr>
+          <w:b/>
+        </w:rPr>
+        <w:t>Awaiting Delivery</w:t>
+      </w:r>
+      <w:r>
+        <w:t>.</w:t>
+      </w:r>
+    </w:p>
+    <w:p>
+      <w:pPr>
+        <w:pStyle w:val="ListNumber"/>
+      </w:pPr>
+      <w:r>
+        <w:t>Review the incoming delivery or dispatch details.</w:t>
+      </w:r>
+    </w:p>
+    <w:p>
+      <w:pPr>
+        <w:pStyle w:val="ListNumber"/>
+      </w:pPr>
+      <w:r>
+        <w:t>Confirm the relevant project context and follow the delivery through the site-facing process.</w:t>
+      </w:r>
+    </w:p>
+    <w:p/>
+    <w:p>
+      <w:bookmarkStart w:id="90" w:name="toc_heading_90"/>
+      <w:pPr>
+        <w:pStyle w:val="Heading3"/>
+      </w:pPr>
+      <w:r>
+        <w:t>19.3 Human Resource role focus</w:t>
+      </w:r>
+      <w:bookmarkEnd w:id="90"/>
+    </w:p>
+    <w:p/>
+    <w:p>
+      <w:r>
+        <w:t>What:</w:t>
+      </w:r>
+    </w:p>
+    <w:p/>
+    <w:p>
+      <w:pPr>
+        <w:pStyle w:val="ListBullet"/>
+      </w:pPr>
+      <w:r>
+        <w:t>Manage employee records and add new employees.</w:t>
+      </w:r>
+    </w:p>
+    <w:p/>
+    <w:p>
+      <w:r>
+        <w:t>Why:</w:t>
+      </w:r>
+    </w:p>
+    <w:p/>
+    <w:p>
+      <w:pPr>
+        <w:pStyle w:val="ListBullet"/>
+      </w:pPr>
+      <w:r>
+        <w:t>Employee administration supports staffing control and user-account setup for the business.</w:t>
+      </w:r>
+    </w:p>
+    <w:p/>
+    <w:p>
+      <w:r>
+        <w:t>When:</w:t>
+      </w:r>
+    </w:p>
+    <w:p/>
+    <w:p>
+      <w:pPr>
+        <w:pStyle w:val="ListBullet"/>
+      </w:pPr>
+      <w:r>
+        <w:t>When employees join, change status, or need record maintenance.</w:t>
+      </w:r>
+    </w:p>
+    <w:p/>
+    <w:p>
+      <w:r>
+        <w:t>How:</w:t>
+      </w:r>
+    </w:p>
+    <w:p/>
+    <w:p>
+      <w:pPr>
+        <w:pStyle w:val="ListNumber"/>
+      </w:pPr>
+      <w:r>
+        <w:t xml:space="preserve">Open </w:t>
+      </w:r>
+      <w:r>
+        <w:rPr>
+          <w:b/>
+        </w:rPr>
+        <w:t>Employees</w:t>
+      </w:r>
+      <w:r>
+        <w:t xml:space="preserve"> to review the employee list.</w:t>
+      </w:r>
+    </w:p>
+    <w:p>
+      <w:pPr>
+        <w:pStyle w:val="ListNumber"/>
+      </w:pPr>
+      <w:r>
+        <w:t>Use the employee filters and list view to find the required record.</w:t>
+      </w:r>
+    </w:p>
+    <w:p>
+      <w:pPr>
+        <w:pStyle w:val="ListNumber"/>
+      </w:pPr>
+      <w:r>
+        <w:t xml:space="preserve">Open </w:t>
+      </w:r>
+      <w:r>
+        <w:rPr>
+          <w:b/>
+        </w:rPr>
+        <w:t>Add Employee</w:t>
+      </w:r>
+      <w:r>
+        <w:t xml:space="preserve"> when a new employee must be created.</w:t>
+      </w:r>
+    </w:p>
+    <w:p>
+      <w:pPr>
+        <w:pStyle w:val="ListNumber"/>
+      </w:pPr>
+      <w:r>
+        <w:t>Complete the employee details and save the record.</w:t>
+      </w:r>
+    </w:p>
+    <w:p/>
+    <w:p>
+      <w:bookmarkStart w:id="91" w:name="toc_heading_91"/>
+      <w:pPr>
+        <w:pStyle w:val="Heading3"/>
+      </w:pPr>
+      <w:r>
+        <w:t>19.4 PM Clerk role focus</w:t>
+      </w:r>
+      <w:bookmarkEnd w:id="91"/>
+    </w:p>
+    <w:p/>
+    <w:p>
+      <w:r>
+        <w:t>What:</w:t>
+      </w:r>
+    </w:p>
+    <w:p/>
+    <w:p>
+      <w:pPr>
+        <w:pStyle w:val="ListBullet"/>
+      </w:pPr>
+      <w:r>
+        <w:t>Support project teams through daily-task monitoring, progress-tracking views, and end-of-day reporting surfaces.</w:t>
+      </w:r>
+    </w:p>
+    <w:p/>
+    <w:p>
+      <w:r>
+        <w:t>Why:</w:t>
+      </w:r>
+    </w:p>
+    <w:p/>
+    <w:p>
+      <w:pPr>
+        <w:pStyle w:val="ListBullet"/>
+      </w:pPr>
+      <w:r>
+        <w:t>The role helps keep project reporting and task follow-up organized.</w:t>
+      </w:r>
+    </w:p>
+    <w:p/>
+    <w:p>
+      <w:r>
+        <w:t>When:</w:t>
+      </w:r>
+    </w:p>
+    <w:p/>
+    <w:p>
+      <w:pPr>
+        <w:pStyle w:val="ListBullet"/>
+      </w:pPr>
+      <w:r>
+        <w:t>During daily coordination and project reporting cycles.</w:t>
+      </w:r>
+    </w:p>
+    <w:p/>
+    <w:p>
+      <w:r>
+        <w:t>How:</w:t>
+      </w:r>
+    </w:p>
+    <w:p/>
+    <w:p>
+      <w:pPr>
+        <w:pStyle w:val="ListNumber"/>
+      </w:pPr>
+      <w:r>
+        <w:t>Open the daily-tasks or reporting view assigned to the role.</w:t>
+      </w:r>
+    </w:p>
+    <w:p>
+      <w:pPr>
+        <w:pStyle w:val="ListNumber"/>
+      </w:pPr>
+      <w:r>
+        <w:t>Review the project work items requiring update.</w:t>
+      </w:r>
+    </w:p>
+    <w:p>
+      <w:pPr>
+        <w:pStyle w:val="ListNumber"/>
+      </w:pPr>
+      <w:r>
+        <w:t>Use the available project and report views to support task follow-up and reporting.</w:t>
+      </w:r>
+    </w:p>
+    <w:p/>
+    <w:p>
+      <w:bookmarkStart w:id="92" w:name="toc_heading_92"/>
+      <w:pPr>
+        <w:pStyle w:val="Heading3"/>
+      </w:pPr>
+      <w:r>
+        <w:t>19.5 Client role focus</w:t>
+      </w:r>
+      <w:bookmarkEnd w:id="92"/>
+    </w:p>
+    <w:p/>
+    <w:p>
+      <w:r>
+        <w:t>What:</w:t>
+      </w:r>
+    </w:p>
+    <w:p/>
+    <w:p>
+      <w:pPr>
+        <w:pStyle w:val="ListBullet"/>
+      </w:pPr>
+      <w:r>
+        <w:t>View the client quotation in the client portal and respond during negotiation when the quote is in a negotiation stage.</w:t>
+      </w:r>
+    </w:p>
+    <w:p/>
+    <w:p>
+      <w:r>
+        <w:t>Why:</w:t>
+      </w:r>
+    </w:p>
+    <w:p/>
+    <w:p>
+      <w:pPr>
+        <w:pStyle w:val="ListBullet"/>
+      </w:pPr>
+      <w:r>
+        <w:t>The client-facing quote view supports controlled commercial communication without exposing internal operational pages.</w:t>
+      </w:r>
+    </w:p>
+    <w:p/>
+    <w:p>
+      <w:r>
+        <w:t>When:</w:t>
+      </w:r>
+    </w:p>
+    <w:p/>
+    <w:p>
+      <w:pPr>
+        <w:pStyle w:val="ListBullet"/>
+      </w:pPr>
+      <w:r>
+        <w:t>When a quotation is shared for client review.</w:t>
+      </w:r>
+    </w:p>
+    <w:p>
+      <w:pPr>
+        <w:pStyle w:val="ListBullet"/>
+      </w:pPr>
+      <w:r>
+        <w:t>During negotiation rounds.</w:t>
+      </w:r>
+    </w:p>
+    <w:p/>
+    <w:p>
+      <w:r>
+        <w:t>How:</w:t>
+      </w:r>
+    </w:p>
+    <w:p/>
+    <w:p>
+      <w:pPr>
+        <w:pStyle w:val="ListNumber"/>
+      </w:pPr>
+      <w:r>
+        <w:t>Open the client quotation link or client quote page.</w:t>
+      </w:r>
+    </w:p>
+    <w:p>
+      <w:pPr>
+        <w:pStyle w:val="ListNumber"/>
+      </w:pPr>
+      <w:r>
+        <w:t>Review the quotation lines, totals, and negotiation history.</w:t>
+      </w:r>
+    </w:p>
+    <w:p>
+      <w:pPr>
+        <w:pStyle w:val="ListNumber"/>
+      </w:pPr>
+      <w:r>
+        <w:t>Submit a negotiation proposal when the quote is in an open negotiation state.</w:t>
+      </w:r>
+    </w:p>
+    <w:p/>
+    <w:p>
+      <w:bookmarkStart w:id="93" w:name="toc_heading_93"/>
+      <w:pPr>
+        <w:pStyle w:val="Heading3"/>
+      </w:pPr>
+      <w:r>
+        <w:t>19.6 Viewer role focus</w:t>
+      </w:r>
+      <w:bookmarkEnd w:id="93"/>
+    </w:p>
+    <w:p/>
+    <w:p>
+      <w:r>
+        <w:t>What:</w:t>
+      </w:r>
+    </w:p>
+    <w:p/>
+    <w:p>
+      <w:pPr>
+        <w:pStyle w:val="ListBullet"/>
+      </w:pPr>
+      <w:r>
+        <w:t>Use read-only project visibility without operational editing responsibilities.</w:t>
+      </w:r>
+    </w:p>
+    <w:p/>
+    <w:p>
+      <w:r>
+        <w:t>Why:</w:t>
+      </w:r>
+    </w:p>
+    <w:p/>
+    <w:p>
+      <w:pPr>
+        <w:pStyle w:val="ListBullet"/>
+      </w:pPr>
+      <w:r>
+        <w:t>Some users need oversight access without being allowed to change live operational records.</w:t>
+      </w:r>
+    </w:p>
+    <w:p/>
+    <w:p>
+      <w:r>
+        <w:t>When:</w:t>
+      </w:r>
+    </w:p>
+    <w:p/>
+    <w:p>
+      <w:pPr>
+        <w:pStyle w:val="ListBullet"/>
+      </w:pPr>
+      <w:r>
+        <w:t>During monitoring, observation, or management-support review.</w:t>
+      </w:r>
+    </w:p>
+    <w:p/>
+    <w:p>
+      <w:r>
+        <w:t>How:</w:t>
+      </w:r>
+    </w:p>
+    <w:p/>
+    <w:p>
+      <w:pPr>
+        <w:pStyle w:val="ListNumber"/>
+      </w:pPr>
+      <w:r>
+        <w:t>Open the permitted project view.</w:t>
+      </w:r>
+    </w:p>
+    <w:p>
+      <w:pPr>
+        <w:pStyle w:val="ListNumber"/>
+      </w:pPr>
+      <w:r>
+        <w:t>Review the project status, customer, and operational information.</w:t>
+      </w:r>
+    </w:p>
+    <w:p>
+      <w:pPr>
+        <w:pStyle w:val="ListNumber"/>
+      </w:pPr>
+      <w:r>
+        <w:t>Escalate changes to the operational owner when action is required.</w:t>
+      </w:r>
+    </w:p>
+    <w:p/>
+    <w:p>
+      <w:bookmarkStart w:id="94" w:name="toc_heading_94"/>
       <w:pPr>
         <w:pStyle w:val="Heading2"/>
       </w:pPr>
       <w:r>
         <w:t>20. Common Questions</w:t>
       </w:r>
-      <w:bookmarkEnd w:id="85"/>
-    </w:p>
-    <w:p/>
-    <w:p>
-      <w:bookmarkStart w:id="86" w:name="toc_heading_86"/>
+      <w:bookmarkEnd w:id="94"/>
+    </w:p>
+    <w:p/>
+    <w:p>
+      <w:bookmarkStart w:id="95" w:name="toc_heading_95"/>
       <w:pPr>
         <w:pStyle w:val="Heading3"/>
       </w:pPr>
       <w:r>
         <w:t>20.1 Why can one user see pages that another user cannot?</w:t>
       </w:r>
-      <w:bookmarkEnd w:id="86"/>
+      <w:bookmarkEnd w:id="95"/>
     </w:p>
     <w:p/>
     <w:p>
@@ -7587,14 +8819,14 @@
     </w:p>
     <w:p/>
     <w:p>
-      <w:bookmarkStart w:id="87" w:name="toc_heading_87"/>
+      <w:bookmarkStart w:id="96" w:name="toc_heading_96"/>
       <w:pPr>
         <w:pStyle w:val="Heading3"/>
       </w:pPr>
       <w:r>
         <w:t>20.2 Why does a quote not move forward automatically?</w:t>
       </w:r>
-      <w:bookmarkEnd w:id="87"/>
+      <w:bookmarkEnd w:id="96"/>
     </w:p>
     <w:p/>
     <w:p>
@@ -7604,14 +8836,14 @@
     </w:p>
     <w:p/>
     <w:p>
-      <w:bookmarkStart w:id="88" w:name="toc_heading_88"/>
+      <w:bookmarkStart w:id="97" w:name="toc_heading_97"/>
       <w:pPr>
         <w:pStyle w:val="Heading3"/>
       </w:pPr>
       <w:r>
         <w:t>20.3 Why can a user open the dashboard but not a certain module?</w:t>
       </w:r>
-      <w:bookmarkEnd w:id="88"/>
+      <w:bookmarkEnd w:id="97"/>
     </w:p>
     <w:p/>
     <w:p>
@@ -7621,14 +8853,14 @@
     </w:p>
     <w:p/>
     <w:p>
-      <w:bookmarkStart w:id="89" w:name="toc_heading_89"/>
+      <w:bookmarkStart w:id="98" w:name="toc_heading_98"/>
       <w:pPr>
         <w:pStyle w:val="Heading3"/>
       </w:pPr>
       <w:r>
         <w:t>20.4 Why are some roles in this manual described without screenshots?</w:t>
       </w:r>
-      <w:bookmarkEnd w:id="89"/>
+      <w:bookmarkEnd w:id="98"/>
     </w:p>
     <w:p/>
     <w:p>
@@ -7638,14 +8870,14 @@
     </w:p>
     <w:p/>
     <w:p>
-      <w:bookmarkStart w:id="90" w:name="toc_heading_90"/>
+      <w:bookmarkStart w:id="99" w:name="toc_heading_99"/>
       <w:pPr>
         <w:pStyle w:val="Heading2"/>
       </w:pPr>
       <w:r>
         <w:t>21. Screenshot Register</w:t>
       </w:r>
-      <w:bookmarkEnd w:id="90"/>
+      <w:bookmarkEnd w:id="99"/>
     </w:p>
     <w:p/>
     <w:p>
@@ -7760,14 +8992,14 @@
     </w:p>
     <w:p/>
     <w:p>
-      <w:bookmarkStart w:id="91" w:name="toc_heading_91"/>
+      <w:bookmarkStart w:id="100" w:name="toc_heading_100"/>
       <w:pPr>
         <w:pStyle w:val="Heading2"/>
       </w:pPr>
       <w:r>
         <w:t>22. Final Note</w:t>
       </w:r>
-      <w:bookmarkEnd w:id="91"/>
+      <w:bookmarkEnd w:id="100"/>
     </w:p>
     <w:p/>
     <w:p>

</xml_diff>